<commit_message>
added soundtrack and working on rigs
</commit_message>
<xml_diff>
--- a/docs/Technical_Specification.docx
+++ b/docs/Technical_Specification.docx
@@ -4,53 +4,90 @@
   <w:body>
     <w:p>
       <w:pPr>
-        <w:keepNext/>
-        <w:pBdr>
-          <w:top w:val="nil"/>
-          <w:left w:val="nil"/>
-          <w:bottom w:val="nil"/>
-          <w:right w:val="nil"/>
-          <w:between w:val="nil"/>
-        </w:pBdr>
-        <w:spacing w:after="360" w:line="360" w:lineRule="auto"/>
+        <w:spacing w:line="360" w:lineRule="auto"/>
+        <w:jc w:val="center"/>
+        <w:rPr>
+          <w:b/>
+          <w:bCs/>
+          <w:color w:val="000000"/>
+          <w:sz w:val="28"/>
+          <w:szCs w:val="28"/>
+          <w:lang w:val="ru-RU"/>
+        </w:rPr>
+      </w:pPr>
+      <w:r>
+        <w:rPr>
+          <w:b/>
+          <w:bCs/>
+          <w:color w:val="000000"/>
+          <w:sz w:val="28"/>
+          <w:szCs w:val="28"/>
+          <w:lang w:val="ru-RU"/>
+        </w:rPr>
+        <w:t>Приложение А – Техническое задание</w:t>
+      </w:r>
+    </w:p>
+    <w:p>
+      <w:pPr>
+        <w:spacing w:line="360" w:lineRule="auto"/>
+        <w:jc w:val="center"/>
+        <w:rPr>
+          <w:b/>
+          <w:bCs/>
+          <w:color w:val="000000"/>
+          <w:sz w:val="28"/>
+          <w:szCs w:val="28"/>
+          <w:lang w:val="ru-RU"/>
+        </w:rPr>
+      </w:pPr>
+    </w:p>
+    <w:p>
+      <w:pPr>
+        <w:spacing w:line="360" w:lineRule="auto"/>
+        <w:jc w:val="center"/>
+        <w:rPr>
+          <w:b/>
+          <w:bCs/>
+          <w:sz w:val="28"/>
+          <w:szCs w:val="28"/>
+        </w:rPr>
+      </w:pPr>
+      <w:r>
+        <w:rPr>
+          <w:b/>
+          <w:bCs/>
+          <w:color w:val="000000"/>
+          <w:sz w:val="28"/>
+          <w:szCs w:val="28"/>
+        </w:rPr>
+        <w:t>АВТОНОМНАЯ НЕКОММЕРЧЕСКАЯ ОРГАНИЗАЦИЯ ПРОФЕССИОНАЛЬНАЯ ОБРАЗОВАТЕЛЬНАЯ ОРГАНИЗАЦИЯ МОСКОВСКИЙ МЕЖДУНАРОДНЫЙ КОЛЛЕДЖ ЦИФРОВЫХ ТЕХНОЛОГИЙ «АКАДЕМИЯ ТОП»</w:t>
+      </w:r>
+    </w:p>
+    <w:p>
+      <w:pPr>
+        <w:spacing w:line="360" w:lineRule="auto"/>
         <w:ind w:firstLine="851"/>
         <w:jc w:val="center"/>
         <w:rPr>
           <w:b/>
           <w:bCs/>
-          <w:color w:val="000000"/>
-          <w:sz w:val="28"/>
-          <w:szCs w:val="28"/>
-        </w:rPr>
-      </w:pPr>
-      <w:bookmarkStart w:id="0" w:name="_heading=h.66t10d1uorfw" w:colFirst="0" w:colLast="0"/>
-      <w:bookmarkEnd w:id="0"/>
-      <w:r>
-        <w:rPr>
-          <w:b/>
-          <w:bCs/>
-          <w:color w:val="000000"/>
-          <w:sz w:val="28"/>
-          <w:szCs w:val="28"/>
-        </w:rPr>
-        <w:t>Приложение А – Техническое задание</w:t>
-      </w:r>
+          <w:sz w:val="28"/>
+          <w:szCs w:val="28"/>
+        </w:rPr>
+      </w:pPr>
     </w:p>
     <w:p>
       <w:pPr>
         <w:spacing w:line="360" w:lineRule="auto"/>
         <w:ind w:firstLine="851"/>
         <w:jc w:val="center"/>
-      </w:pPr>
-      <w:r>
-        <w:rPr>
-          <w:b/>
-          <w:bCs/>
-          <w:sz w:val="28"/>
-          <w:szCs w:val="28"/>
-        </w:rPr>
-        <w:t>Илья разберется</w:t>
-      </w:r>
+        <w:rPr>
+          <w:b/>
+          <w:bCs/>
+          <w:sz w:val="28"/>
+          <w:szCs w:val="28"/>
+        </w:rPr>
+      </w:pPr>
     </w:p>
     <w:p>
       <w:pPr>
@@ -94,13 +131,145 @@
     <w:p>
       <w:pPr>
         <w:spacing w:line="360" w:lineRule="auto"/>
+        <w:rPr>
+          <w:b/>
+          <w:bCs/>
+          <w:sz w:val="28"/>
+          <w:szCs w:val="28"/>
+          <w:lang w:val="ru-RU"/>
+        </w:rPr>
+      </w:pPr>
+    </w:p>
+    <w:p>
+      <w:pPr>
+        <w:spacing w:line="360" w:lineRule="auto"/>
+        <w:jc w:val="center"/>
+        <w:rPr>
+          <w:b/>
+          <w:bCs/>
+          <w:sz w:val="28"/>
+          <w:szCs w:val="28"/>
+        </w:rPr>
+      </w:pPr>
+      <w:r>
+        <w:rPr>
+          <w:b/>
+          <w:bCs/>
+          <w:sz w:val="28"/>
+          <w:szCs w:val="28"/>
+        </w:rPr>
+        <w:t>Техническое задание</w:t>
+      </w:r>
+    </w:p>
+    <w:p>
+      <w:pPr>
+        <w:spacing w:line="360" w:lineRule="auto"/>
+        <w:jc w:val="center"/>
+        <w:rPr>
+          <w:b/>
+          <w:bCs/>
+          <w:sz w:val="28"/>
+          <w:szCs w:val="28"/>
+          <w:lang w:val="ru-RU"/>
+        </w:rPr>
+      </w:pPr>
+      <w:r>
+        <w:rPr>
+          <w:b/>
+          <w:bCs/>
+          <w:sz w:val="28"/>
+          <w:szCs w:val="28"/>
+          <w:lang w:val="ru-RU"/>
+        </w:rPr>
+        <w:t xml:space="preserve">СИНГЛПЛЕЕРНАЯ </w:t>
+      </w:r>
+      <w:r>
+        <w:rPr>
+          <w:b/>
+          <w:bCs/>
+          <w:sz w:val="28"/>
+          <w:szCs w:val="28"/>
+          <w:lang w:val="ru-RU"/>
+        </w:rPr>
+        <w:t>ИГРА</w:t>
+      </w:r>
+      <w:r>
+        <w:rPr>
+          <w:b/>
+          <w:bCs/>
+          <w:sz w:val="28"/>
+          <w:szCs w:val="28"/>
+          <w:lang w:val="ru-RU"/>
+        </w:rPr>
+        <w:t xml:space="preserve"> </w:t>
+      </w:r>
+      <w:r>
+        <w:rPr>
+          <w:b/>
+          <w:bCs/>
+          <w:sz w:val="28"/>
+          <w:szCs w:val="28"/>
+        </w:rPr>
+        <w:t>«</w:t>
+      </w:r>
+      <w:r>
+        <w:rPr>
+          <w:b/>
+          <w:bCs/>
+          <w:sz w:val="28"/>
+          <w:szCs w:val="28"/>
+        </w:rPr>
+        <w:t>S</w:t>
+      </w:r>
+      <w:r>
+        <w:rPr>
+          <w:b/>
+          <w:bCs/>
+          <w:sz w:val="28"/>
+          <w:szCs w:val="28"/>
+          <w:lang w:val="en-US"/>
+        </w:rPr>
+        <w:t>UFFER</w:t>
+      </w:r>
+      <w:r>
+        <w:rPr>
+          <w:b/>
+          <w:bCs/>
+          <w:sz w:val="28"/>
+          <w:szCs w:val="28"/>
+          <w:lang w:val="ru-RU"/>
+        </w:rPr>
+        <w:t>’</w:t>
+      </w:r>
+      <w:r>
+        <w:rPr>
+          <w:b/>
+          <w:bCs/>
+          <w:sz w:val="28"/>
+          <w:szCs w:val="28"/>
+          <w:lang w:val="en-US"/>
+        </w:rPr>
+        <w:t>S</w:t>
+      </w:r>
+      <w:r>
+        <w:rPr>
+          <w:b/>
+          <w:bCs/>
+          <w:sz w:val="28"/>
+          <w:szCs w:val="28"/>
+        </w:rPr>
+        <w:t>»</w:t>
+      </w:r>
+    </w:p>
+    <w:p>
+      <w:pPr>
+        <w:spacing w:line="360" w:lineRule="auto"/>
         <w:ind w:firstLine="851"/>
         <w:jc w:val="center"/>
         <w:rPr>
-          <w:b/>
-          <w:bCs/>
-          <w:sz w:val="28"/>
-          <w:szCs w:val="28"/>
+          <w:sz w:val="28"/>
+          <w:szCs w:val="28"/>
+          <w:lang w:val="ru-RU"/>
         </w:rPr>
       </w:pPr>
     </w:p>
@@ -110,8 +279,6 @@
         <w:ind w:firstLine="851"/>
         <w:jc w:val="center"/>
         <w:rPr>
-          <w:b/>
-          <w:bCs/>
           <w:sz w:val="28"/>
           <w:szCs w:val="28"/>
         </w:rPr>
@@ -123,8 +290,6 @@
         <w:ind w:firstLine="851"/>
         <w:jc w:val="center"/>
         <w:rPr>
-          <w:b/>
-          <w:bCs/>
           <w:sz w:val="28"/>
           <w:szCs w:val="28"/>
         </w:rPr>
@@ -136,182 +301,12 @@
         <w:ind w:firstLine="851"/>
         <w:jc w:val="center"/>
         <w:rPr>
-          <w:b/>
-          <w:bCs/>
-          <w:sz w:val="28"/>
-          <w:szCs w:val="28"/>
-        </w:rPr>
-      </w:pPr>
-    </w:p>
-    <w:p>
-      <w:pPr>
-        <w:spacing w:line="360" w:lineRule="auto"/>
-        <w:ind w:firstLine="851"/>
-        <w:jc w:val="center"/>
-        <w:rPr>
-          <w:b/>
-          <w:bCs/>
-          <w:sz w:val="28"/>
-          <w:szCs w:val="28"/>
-        </w:rPr>
-      </w:pPr>
-      <w:r>
-        <w:rPr>
-          <w:b/>
-          <w:bCs/>
-          <w:sz w:val="28"/>
-          <w:szCs w:val="28"/>
-        </w:rPr>
-        <w:t>Техническое задание</w:t>
-      </w:r>
-    </w:p>
-    <w:p>
-      <w:pPr>
-        <w:spacing w:line="360" w:lineRule="auto"/>
-        <w:ind w:firstLine="851"/>
-        <w:jc w:val="center"/>
-        <w:rPr>
-          <w:b/>
-          <w:bCs/>
-          <w:sz w:val="28"/>
-          <w:szCs w:val="28"/>
-          <w:lang w:val="ru-RU"/>
-        </w:rPr>
-      </w:pPr>
-      <w:r>
-        <w:rPr>
-          <w:b/>
-          <w:bCs/>
-          <w:sz w:val="28"/>
-          <w:szCs w:val="28"/>
-          <w:lang w:val="ru-RU"/>
-        </w:rPr>
-        <w:t xml:space="preserve">СИНГЛПЛЕЕРНАЯ </w:t>
-      </w:r>
-      <w:r>
-        <w:rPr>
-          <w:b/>
-          <w:bCs/>
-          <w:sz w:val="28"/>
-          <w:szCs w:val="28"/>
-          <w:lang w:val="ru-RU"/>
-        </w:rPr>
-        <w:t>ИГРА</w:t>
-      </w:r>
-      <w:r>
-        <w:rPr>
-          <w:b/>
-          <w:bCs/>
-          <w:sz w:val="28"/>
-          <w:szCs w:val="28"/>
-          <w:lang w:val="ru-RU"/>
-        </w:rPr>
-        <w:t xml:space="preserve"> </w:t>
-      </w:r>
-      <w:r>
-        <w:rPr>
-          <w:b/>
-          <w:bCs/>
-          <w:sz w:val="28"/>
-          <w:szCs w:val="28"/>
-        </w:rPr>
-        <w:t>«</w:t>
-      </w:r>
-      <w:r>
-        <w:rPr>
-          <w:b/>
-          <w:bCs/>
-          <w:sz w:val="28"/>
-          <w:szCs w:val="28"/>
-        </w:rPr>
-        <w:t>S</w:t>
-      </w:r>
-      <w:r>
-        <w:rPr>
-          <w:b/>
-          <w:bCs/>
-          <w:sz w:val="28"/>
-          <w:szCs w:val="28"/>
-          <w:lang w:val="en-US"/>
-        </w:rPr>
-        <w:t>UFFER</w:t>
-      </w:r>
-      <w:r>
-        <w:rPr>
-          <w:b/>
-          <w:bCs/>
-          <w:sz w:val="28"/>
-          <w:szCs w:val="28"/>
-          <w:lang w:val="ru-RU"/>
-        </w:rPr>
-        <w:t>’</w:t>
-      </w:r>
-      <w:r>
-        <w:rPr>
-          <w:b/>
-          <w:bCs/>
-          <w:sz w:val="28"/>
-          <w:szCs w:val="28"/>
-          <w:lang w:val="en-US"/>
-        </w:rPr>
-        <w:t>S</w:t>
-      </w:r>
-      <w:r>
-        <w:rPr>
-          <w:b/>
-          <w:bCs/>
-          <w:sz w:val="28"/>
-          <w:szCs w:val="28"/>
-        </w:rPr>
-        <w:t>»</w:t>
-      </w:r>
-    </w:p>
-    <w:p>
-      <w:pPr>
-        <w:spacing w:line="360" w:lineRule="auto"/>
-        <w:ind w:firstLine="851"/>
-        <w:jc w:val="center"/>
-        <w:rPr>
-          <w:sz w:val="28"/>
-          <w:szCs w:val="28"/>
-          <w:lang w:val="ru-RU"/>
-        </w:rPr>
-      </w:pPr>
-    </w:p>
-    <w:p>
-      <w:pPr>
-        <w:spacing w:line="360" w:lineRule="auto"/>
-        <w:ind w:firstLine="851"/>
-        <w:jc w:val="center"/>
-        <w:rPr>
-          <w:sz w:val="28"/>
-          <w:szCs w:val="28"/>
-        </w:rPr>
-      </w:pPr>
-    </w:p>
-    <w:p>
-      <w:pPr>
-        <w:spacing w:line="360" w:lineRule="auto"/>
-        <w:ind w:firstLine="851"/>
-        <w:jc w:val="center"/>
-        <w:rPr>
-          <w:sz w:val="28"/>
-          <w:szCs w:val="28"/>
-        </w:rPr>
-      </w:pPr>
-    </w:p>
-    <w:p>
-      <w:pPr>
-        <w:spacing w:line="360" w:lineRule="auto"/>
-        <w:ind w:firstLine="851"/>
-        <w:jc w:val="center"/>
-        <w:rPr>
-          <w:sz w:val="28"/>
-          <w:szCs w:val="28"/>
-        </w:rPr>
-      </w:pPr>
-      <w:bookmarkStart w:id="1" w:name="_heading=h.dzw7rrtue6lb" w:colFirst="0" w:colLast="0"/>
-      <w:bookmarkEnd w:id="1"/>
+          <w:sz w:val="28"/>
+          <w:szCs w:val="28"/>
+        </w:rPr>
+      </w:pPr>
+      <w:bookmarkStart w:id="0" w:name="_heading=h.dzw7rrtue6lb" w:colFirst="0" w:colLast="0"/>
+      <w:bookmarkEnd w:id="0"/>
     </w:p>
     <w:p>
       <w:pPr>
@@ -621,106 +616,76 @@
     <w:p>
       <w:pPr>
         <w:spacing w:line="360" w:lineRule="auto"/>
-        <w:ind w:firstLine="851"/>
-        <w:jc w:val="center"/>
-        <w:rPr>
-          <w:sz w:val="28"/>
-          <w:szCs w:val="28"/>
-        </w:rPr>
-      </w:pPr>
-    </w:p>
-    <w:p>
-      <w:pPr>
-        <w:spacing w:line="360" w:lineRule="auto"/>
-        <w:ind w:firstLine="851"/>
-        <w:jc w:val="center"/>
-        <w:rPr>
-          <w:sz w:val="28"/>
-          <w:szCs w:val="28"/>
-        </w:rPr>
-      </w:pPr>
-    </w:p>
-    <w:p>
-      <w:pPr>
-        <w:spacing w:line="360" w:lineRule="auto"/>
-        <w:ind w:firstLine="851"/>
-        <w:jc w:val="center"/>
-        <w:rPr>
-          <w:sz w:val="28"/>
-          <w:szCs w:val="28"/>
-        </w:rPr>
-      </w:pPr>
-    </w:p>
-    <w:p>
-      <w:pPr>
-        <w:spacing w:line="360" w:lineRule="auto"/>
-        <w:ind w:firstLine="851"/>
-        <w:jc w:val="center"/>
-        <w:rPr>
-          <w:sz w:val="28"/>
-          <w:szCs w:val="28"/>
-        </w:rPr>
-      </w:pPr>
-    </w:p>
-    <w:p>
-      <w:pPr>
-        <w:spacing w:line="360" w:lineRule="auto"/>
-        <w:ind w:firstLine="851"/>
-        <w:jc w:val="center"/>
-        <w:rPr>
-          <w:sz w:val="28"/>
-          <w:szCs w:val="28"/>
-        </w:rPr>
-      </w:pPr>
-    </w:p>
-    <w:p>
-      <w:pPr>
-        <w:spacing w:line="360" w:lineRule="auto"/>
-        <w:ind w:firstLine="851"/>
-        <w:jc w:val="center"/>
-        <w:rPr>
-          <w:sz w:val="28"/>
-          <w:szCs w:val="28"/>
-        </w:rPr>
-      </w:pPr>
-    </w:p>
-    <w:p>
-      <w:pPr>
-        <w:spacing w:line="360" w:lineRule="auto"/>
-        <w:ind w:firstLine="851"/>
-        <w:jc w:val="center"/>
-        <w:rPr>
-          <w:sz w:val="28"/>
-          <w:szCs w:val="28"/>
-        </w:rPr>
-      </w:pPr>
-    </w:p>
-    <w:p>
-      <w:pPr>
-        <w:spacing w:line="360" w:lineRule="auto"/>
-        <w:ind w:firstLine="851"/>
-        <w:jc w:val="center"/>
-        <w:rPr>
-          <w:sz w:val="28"/>
-          <w:szCs w:val="28"/>
-        </w:rPr>
-      </w:pPr>
-    </w:p>
-    <w:p>
-      <w:pPr>
-        <w:spacing w:line="360" w:lineRule="auto"/>
-        <w:ind w:firstLine="851"/>
-        <w:jc w:val="center"/>
-        <w:rPr>
-          <w:sz w:val="28"/>
-          <w:szCs w:val="28"/>
-        </w:rPr>
-      </w:pPr>
-    </w:p>
-    <w:p>
-      <w:pPr>
-        <w:spacing w:line="360" w:lineRule="auto"/>
-        <w:ind w:firstLine="851"/>
+        <w:rPr>
+          <w:sz w:val="28"/>
+          <w:szCs w:val="28"/>
+          <w:lang w:val="ru-RU"/>
+        </w:rPr>
+      </w:pPr>
+    </w:p>
+    <w:p>
+      <w:pPr>
+        <w:spacing w:line="360" w:lineRule="auto"/>
+        <w:rPr>
+          <w:sz w:val="28"/>
+          <w:szCs w:val="28"/>
+          <w:lang w:val="ru-RU"/>
+        </w:rPr>
+      </w:pPr>
+    </w:p>
+    <w:p>
+      <w:pPr>
+        <w:spacing w:line="360" w:lineRule="auto"/>
+        <w:rPr>
+          <w:sz w:val="28"/>
+          <w:szCs w:val="28"/>
+          <w:lang w:val="ru-RU"/>
+        </w:rPr>
+      </w:pPr>
+    </w:p>
+    <w:p>
+      <w:pPr>
+        <w:spacing w:line="360" w:lineRule="auto"/>
+        <w:rPr>
+          <w:sz w:val="28"/>
+          <w:szCs w:val="28"/>
+          <w:lang w:val="ru-RU"/>
+        </w:rPr>
+      </w:pPr>
+    </w:p>
+    <w:p>
+      <w:pPr>
+        <w:spacing w:line="360" w:lineRule="auto"/>
+        <w:rPr>
+          <w:sz w:val="28"/>
+          <w:szCs w:val="28"/>
+          <w:lang w:val="ru-RU"/>
+        </w:rPr>
+      </w:pPr>
+    </w:p>
+    <w:p>
+      <w:pPr>
+        <w:spacing w:line="360" w:lineRule="auto"/>
+        <w:rPr>
+          <w:sz w:val="28"/>
+          <w:szCs w:val="28"/>
+          <w:lang w:val="ru-RU"/>
+        </w:rPr>
+      </w:pPr>
+    </w:p>
+    <w:p>
+      <w:pPr>
+        <w:spacing w:line="360" w:lineRule="auto"/>
+        <w:rPr>
+          <w:sz w:val="28"/>
+          <w:szCs w:val="28"/>
+          <w:lang w:val="ru-RU"/>
+        </w:rPr>
+      </w:pPr>
+    </w:p>
+    <w:p>
+      <w:pPr>
+        <w:spacing w:line="360" w:lineRule="auto"/>
         <w:jc w:val="center"/>
         <w:rPr>
           <w:b/>
@@ -1024,8 +989,8 @@
           <w:lang w:val="ru-RU"/>
         </w:rPr>
       </w:pPr>
-      <w:bookmarkStart w:id="2" w:name="_heading=h.rr5wtpuhgwwb" w:colFirst="0" w:colLast="0"/>
-      <w:bookmarkEnd w:id="2"/>
+      <w:bookmarkStart w:id="1" w:name="_heading=h.rr5wtpuhgwwb" w:colFirst="0" w:colLast="0"/>
+      <w:bookmarkEnd w:id="1"/>
       <w:r>
         <w:rPr>
           <w:b/>
@@ -3057,7 +3022,6 @@
   <w:style w:type="character" w:default="1" w:styleId="a0">
     <w:name w:val="Default Paragraph Font"/>
     <w:uiPriority w:val="1"/>
-    <w:semiHidden/>
     <w:unhideWhenUsed/>
   </w:style>
   <w:style w:type="table" w:default="1" w:styleId="a1">

</xml_diff>